<commit_message>
Guide et état du projet : export Excel d'Analyse
Co-Authored-By: Claude Opus 5.5 <noreply@anthropic.com>
</commit_message>
<xml_diff>
--- a/docs/guides/word/Guide_analyse.docx
+++ b/docs/guides/word/Guide_analyse.docx
@@ -424,6 +424,45 @@
           <w:szCs w:val="20"/>
         </w:rPr>
         <w:t xml:space="preserve"> : survoler un graphique donne la valeur exacte ; les légendes masquent ou montrent une série.</w:t>
+      </w:r>
+    </w:p>
+    <w:p>
+      <w:pPr>
+        <w:tabs>
+          <w:tab w:val="left" w:pos="360"/>
+        </w:tabs>
+        <w:spacing w:after="60"/>
+        <w:ind w:left="360" w:hanging="360"/>
+        <w:jc w:val="both"/>
+      </w:pPr>
+      <w:r>
+        <w:rPr>
+          <w:rFonts w:ascii="Calibri" w:cs="Calibri" w:eastAsia="Calibri" w:hAnsi="Calibri"/>
+          <w:b/>
+          <w:bCs/>
+          <w:color w:val="1A9E9E"/>
+          <w:sz w:val="20"/>
+          <w:szCs w:val="20"/>
+        </w:rPr>
+        <w:t xml:space="preserve">•	</w:t>
+      </w:r>
+      <w:r>
+        <w:rPr>
+          <w:rFonts w:ascii="Calibri" w:cs="Calibri" w:eastAsia="Calibri" w:hAnsi="Calibri"/>
+          <w:b/>
+          <w:bCs/>
+          <w:sz w:val="20"/>
+          <w:szCs w:val="20"/>
+        </w:rPr>
+        <w:t xml:space="preserve">Excel</w:t>
+      </w:r>
+      <w:r>
+        <w:rPr>
+          <w:rFonts w:ascii="Calibri" w:cs="Calibri" w:eastAsia="Calibri" w:hAnsi="Calibri"/>
+          <w:sz w:val="20"/>
+          <w:szCs w:val="20"/>
+        </w:rPr>
+        <w:t xml:space="preserve"> : le bouton « Excel » télécharge toutes les données de l'écran, pour la période choisie, dans un classeur : un onglet de synthèse (société, période, fiabilité, indicateurs), un onglet des constats, puis un onglet par tableau ou graphique de l'écran, avec filtres. Les chiffres y sont des nombres, prêts pour un tableau croisé dynamique.</w:t>
       </w:r>
     </w:p>
     <w:p>

</xml_diff>